<commit_message>
Fill student details on all three report title pages
Add student name, institute, specialization, study form and group.
Remove the completed title-page reminder from README.
</commit_message>
<xml_diff>
--- a/reports/ЛР02_Часть_1.docx
+++ b/reports/ЛР02_Часть_1.docx
@@ -284,6 +284,15 @@
                 <w:szCs w:val="26"/>
               </w:rPr>
             </w:pPr>
+            <w:r>
+              <w:rPr>
+                <w:rFonts w:ascii="Times New Roman" w:hAnsi="Times New Roman"/>
+                <w:b w:val="0"/>
+                <w:color w:val="000000"/>
+                <w:sz w:val="28"/>
+              </w:rPr>
+              <w:t>Институт Информационных технологий</w:t>
+            </w:r>
           </w:p>
         </w:tc>
       </w:tr>
@@ -416,6 +425,15 @@
                 <w:szCs w:val="26"/>
               </w:rPr>
             </w:pPr>
+            <w:r>
+              <w:rPr>
+                <w:rFonts w:ascii="Times New Roman" w:hAnsi="Times New Roman"/>
+                <w:b w:val="0"/>
+                <w:color w:val="000000"/>
+                <w:sz w:val="28"/>
+              </w:rPr>
+              <w:t>09.03.02 Информационные системы и технологии</w:t>
+            </w:r>
           </w:p>
         </w:tc>
       </w:tr>
@@ -570,6 +588,15 @@
                 <w:szCs w:val="24"/>
               </w:rPr>
             </w:pPr>
+            <w:r>
+              <w:rPr>
+                <w:rFonts w:ascii="Times New Roman" w:hAnsi="Times New Roman"/>
+                <w:b w:val="0"/>
+                <w:color w:val="000000"/>
+                <w:sz w:val="28"/>
+              </w:rPr>
+              <w:t>Очная</w:t>
+            </w:r>
           </w:p>
         </w:tc>
       </w:tr>
@@ -1220,6 +1247,15 @@
                 <w:szCs w:val="26"/>
               </w:rPr>
             </w:pPr>
+            <w:r>
+              <w:rPr>
+                <w:rFonts w:ascii="Times New Roman" w:hAnsi="Times New Roman"/>
+                <w:b w:val="0"/>
+                <w:color w:val="000000"/>
+                <w:sz w:val="28"/>
+              </w:rPr>
+              <w:t>Тишин М. С.</w:t>
+            </w:r>
           </w:p>
         </w:tc>
         <w:tc>
@@ -1424,6 +1460,15 @@
                 <w:szCs w:val="26"/>
               </w:rPr>
             </w:pPr>
+            <w:r>
+              <w:rPr>
+                <w:rFonts w:ascii="Times New Roman" w:hAnsi="Times New Roman"/>
+                <w:b w:val="0"/>
+                <w:color w:val="000000"/>
+                <w:sz w:val="28"/>
+              </w:rPr>
+              <w:t>ВБИо-401рсоб</w:t>
+            </w:r>
           </w:p>
         </w:tc>
         <w:tc>

</xml_diff>